<commit_message>
Popunjeni podnaslovi vezani uz modeliranje
</commit_message>
<xml_diff>
--- a/docs/Tehnička dokumentacija.docx
+++ b/docs/Tehnička dokumentacija.docx
@@ -73,7 +73,7 @@
           <w:sz w:val="28"/>
           <w:lang w:val="hr-HR"/>
         </w:rPr>
-        <w:t>1</w:t>
+        <w:t>2</w:t>
       </w:r>
       <w:r>
         <w:rPr>
@@ -2559,31 +2559,7 @@
         <w:rPr>
           <w:lang w:val="hr-HR"/>
         </w:rPr>
-        <w:t>[motivacija</w:t>
-      </w:r>
-      <w:r>
-        <w:rPr>
-          <w:lang w:val="hr-HR"/>
-        </w:rPr>
-        <w:t xml:space="preserve"> za odabir</w:t>
-      </w:r>
-      <w:r>
-        <w:rPr>
-          <w:lang w:val="hr-HR"/>
-        </w:rPr>
-        <w:t xml:space="preserve"> teme</w:t>
-      </w:r>
-      <w:r>
-        <w:rPr>
-          <w:lang w:val="hr-HR"/>
-        </w:rPr>
-        <w:t>, opis teme</w:t>
-      </w:r>
-      <w:r>
-        <w:rPr>
-          <w:lang w:val="hr-HR"/>
-        </w:rPr>
-        <w:t>]</w:t>
+        <w:t>[motivacija za odabir teme, opis teme]</w:t>
       </w:r>
     </w:p>
     <w:p>
@@ -2767,7 +2743,13 @@
         <w:rPr>
           <w:lang w:val="hr-HR"/>
         </w:rPr>
-        <w:t>Proceduralno generiranje modela</w:t>
+        <w:t>Proceduralno</w:t>
+      </w:r>
+      <w:r>
+        <w:rPr>
+          <w:lang w:val="hr-HR"/>
+        </w:rPr>
+        <w:t xml:space="preserve"> generiranje modela</w:t>
       </w:r>
       <w:bookmarkEnd w:id="7"/>
     </w:p>
@@ -2778,11 +2760,1748 @@
           <w:lang w:val="hr-HR"/>
         </w:rPr>
       </w:pPr>
-      <w:r>
-        <w:rPr>
-          <w:lang w:val="hr-HR"/>
-        </w:rPr>
-        <w:t>[kako su napravljeni modeli zgrada, opisati alate]</w:t>
+    </w:p>
+    <w:p>
+      <w:pPr>
+        <w:ind w:firstLine="720"/>
+        <w:jc w:val="both"/>
+        <w:rPr>
+          <w:lang w:val="hr-HR"/>
+        </w:rPr>
+      </w:pPr>
+      <w:r>
+        <w:rPr>
+          <w:lang w:val="hr-HR"/>
+        </w:rPr>
+        <w:t xml:space="preserve">Proceduralno generiranje modela je način stvaranja 3D modela </w:t>
+      </w:r>
+      <w:r>
+        <w:rPr>
+          <w:lang w:val="hr-HR"/>
+        </w:rPr>
+        <w:t xml:space="preserve">s </w:t>
+      </w:r>
+      <w:r>
+        <w:rPr>
+          <w:lang w:val="hr-HR"/>
+        </w:rPr>
+        <w:t>pomoću skupa unaprijed definiranih pravila, algoritama ili matematičkih funkcija, umjesto ručnog oblikovanja svakog pojedinačnog elementa</w:t>
+      </w:r>
+      <w:r>
+        <w:rPr>
+          <w:lang w:val="hr-HR"/>
+        </w:rPr>
+        <w:t>.</w:t>
+      </w:r>
+      <w:r>
+        <w:rPr>
+          <w:lang w:val="hr-HR"/>
+        </w:rPr>
+        <w:t xml:space="preserve"> </w:t>
+      </w:r>
+      <w:r>
+        <w:rPr>
+          <w:lang w:val="hr-HR"/>
+        </w:rPr>
+        <w:t>P</w:t>
+      </w:r>
+      <w:r>
+        <w:rPr>
+          <w:lang w:val="hr-HR"/>
+        </w:rPr>
+        <w:t>romjenom osnovnih parametara</w:t>
+      </w:r>
+      <w:r>
+        <w:rPr>
+          <w:lang w:val="hr-HR"/>
+        </w:rPr>
+        <w:t xml:space="preserve">, dizajner </w:t>
+      </w:r>
+      <w:r>
+        <w:rPr>
+          <w:lang w:val="hr-HR"/>
+        </w:rPr>
+        <w:t>može regenerirati cijel</w:t>
+      </w:r>
+      <w:r>
+        <w:rPr>
+          <w:lang w:val="hr-HR"/>
+        </w:rPr>
+        <w:t>i model</w:t>
+      </w:r>
+      <w:r>
+        <w:rPr>
+          <w:lang w:val="hr-HR"/>
+        </w:rPr>
+        <w:t xml:space="preserve">, što </w:t>
+      </w:r>
+      <w:r>
+        <w:rPr>
+          <w:lang w:val="hr-HR"/>
+        </w:rPr>
+        <w:t>omogućuje</w:t>
+      </w:r>
+      <w:r>
+        <w:rPr>
+          <w:lang w:val="hr-HR"/>
+        </w:rPr>
+        <w:t xml:space="preserve"> vrlo učinkovit</w:t>
+      </w:r>
+      <w:r>
+        <w:rPr>
+          <w:lang w:val="hr-HR"/>
+        </w:rPr>
+        <w:t>i</w:t>
+      </w:r>
+      <w:r>
+        <w:rPr>
+          <w:lang w:val="hr-HR"/>
+        </w:rPr>
+        <w:t xml:space="preserve"> iterativni rad, </w:t>
+      </w:r>
+      <w:r>
+        <w:rPr>
+          <w:lang w:val="hr-HR"/>
+        </w:rPr>
+        <w:t xml:space="preserve">jednostavno </w:t>
+      </w:r>
+      <w:r>
+        <w:rPr>
+          <w:lang w:val="hr-HR"/>
+        </w:rPr>
+        <w:t>skaliranje i postizanje uvjerljive prirodne raznolikosti</w:t>
+      </w:r>
+      <w:r>
+        <w:rPr>
+          <w:lang w:val="hr-HR"/>
+        </w:rPr>
+        <w:t xml:space="preserve"> u modelima</w:t>
+      </w:r>
+      <w:r>
+        <w:rPr>
+          <w:lang w:val="hr-HR"/>
+        </w:rPr>
+        <w:t>.</w:t>
+      </w:r>
+      <w:r>
+        <w:rPr>
+          <w:lang w:val="hr-HR"/>
+        </w:rPr>
+        <w:t xml:space="preserve"> Proceduralno modeliranje se najviše koristi izradu izuzetno složenih i detaljnih objekata ili cijelih okolina (poput šuma, gradova ili planinskih lanaca) iz minimalnog broja ulaznih podataka.</w:t>
+      </w:r>
+      <w:r>
+        <w:rPr>
+          <w:lang w:val="hr-HR"/>
+        </w:rPr>
+        <w:t xml:space="preserve"> U ovom projektu je proceduralno generiranje korišteno za izradu modela građevina koje služe za izradu grada u kojem dron dostavlja pakete.</w:t>
+      </w:r>
+    </w:p>
+    <w:p>
+      <w:pPr>
+        <w:ind w:firstLine="720"/>
+        <w:jc w:val="both"/>
+        <w:rPr>
+          <w:lang w:val="hr-HR"/>
+        </w:rPr>
+      </w:pPr>
+    </w:p>
+    <w:p>
+      <w:pPr>
+        <w:ind w:firstLine="720"/>
+        <w:jc w:val="both"/>
+        <w:rPr>
+          <w:lang w:val="hr-HR"/>
+        </w:rPr>
+      </w:pPr>
+      <w:r>
+        <w:rPr>
+          <w:lang w:val="hr-HR"/>
+        </w:rPr>
+        <w:t xml:space="preserve">Korišteni alat za ostvarenje proceduralnog generiranja se zove </w:t>
+      </w:r>
+      <w:r>
+        <w:rPr>
+          <w:i/>
+          <w:iCs/>
+          <w:lang w:val="hr-HR"/>
+        </w:rPr>
+        <w:t>Geometry Nodes</w:t>
+      </w:r>
+      <w:r>
+        <w:rPr>
+          <w:lang w:val="hr-HR"/>
+        </w:rPr>
+        <w:t xml:space="preserve">, koji je dio programa </w:t>
+      </w:r>
+      <w:r>
+        <w:rPr>
+          <w:i/>
+          <w:iCs/>
+          <w:lang w:val="hr-HR"/>
+        </w:rPr>
+        <w:t>Blender</w:t>
+      </w:r>
+      <w:r>
+        <w:rPr>
+          <w:lang w:val="hr-HR"/>
+        </w:rPr>
+        <w:t xml:space="preserve">. Alat omogućuje </w:t>
+      </w:r>
+      <w:r>
+        <w:rPr>
+          <w:lang w:val="hr-HR"/>
+        </w:rPr>
+        <w:t xml:space="preserve">generiranje i manipulaciju geometrije </w:t>
+      </w:r>
+      <w:r>
+        <w:rPr>
+          <w:lang w:val="hr-HR"/>
+        </w:rPr>
+        <w:t xml:space="preserve">s </w:t>
+      </w:r>
+      <w:r>
+        <w:rPr>
+          <w:lang w:val="hr-HR"/>
+        </w:rPr>
+        <w:t>pomoću vizualnog sučelja</w:t>
+      </w:r>
+      <w:r>
+        <w:rPr>
+          <w:lang w:val="hr-HR"/>
+        </w:rPr>
+        <w:t>.</w:t>
+      </w:r>
+      <w:r>
+        <w:rPr>
+          <w:lang w:val="hr-HR"/>
+        </w:rPr>
+        <w:t xml:space="preserve"> Pravila i algoritmi za oblikovanje geometrije se definiraju </w:t>
+      </w:r>
+      <w:r>
+        <w:rPr>
+          <w:lang w:val="hr-HR"/>
+        </w:rPr>
+        <w:t xml:space="preserve">s </w:t>
+      </w:r>
+      <w:r>
+        <w:rPr>
+          <w:lang w:val="hr-HR"/>
+        </w:rPr>
+        <w:t>pomoću dijagrama funkcijskih čvorova (</w:t>
+      </w:r>
+      <w:r>
+        <w:rPr>
+          <w:i/>
+          <w:iCs/>
+          <w:lang w:val="hr-HR"/>
+        </w:rPr>
+        <w:t>engl. FBD - Function Block Diagram</w:t>
+      </w:r>
+      <w:r>
+        <w:rPr>
+          <w:lang w:val="hr-HR"/>
+        </w:rPr>
+        <w:t>). Svaki čvor (</w:t>
+      </w:r>
+      <w:r>
+        <w:rPr>
+          <w:i/>
+          <w:iCs/>
+          <w:lang w:val="hr-HR"/>
+        </w:rPr>
+        <w:t>engl. Node</w:t>
+      </w:r>
+      <w:r>
+        <w:rPr>
+          <w:lang w:val="hr-HR"/>
+        </w:rPr>
+        <w:t>) ima ulazne parametre, izvršava neku funkciju i vrača izlazne podatke. Čvorovi se međusobno spajaju poveznicama (</w:t>
+      </w:r>
+      <w:r>
+        <w:rPr>
+          <w:i/>
+          <w:iCs/>
+          <w:lang w:val="hr-HR"/>
+        </w:rPr>
+        <w:t xml:space="preserve">engl. </w:t>
+      </w:r>
+      <w:r>
+        <w:rPr>
+          <w:i/>
+          <w:iCs/>
+          <w:lang w:val="hr-HR"/>
+        </w:rPr>
+        <w:t>Noodle</w:t>
+      </w:r>
+      <w:r>
+        <w:rPr>
+          <w:lang w:val="hr-HR"/>
+        </w:rPr>
+        <w:t>)</w:t>
+      </w:r>
+      <w:r>
+        <w:rPr>
+          <w:lang w:val="hr-HR"/>
+        </w:rPr>
+        <w:t xml:space="preserve"> i time se kontrolira tok podataka kroz algoritam. </w:t>
+      </w:r>
+      <w:r>
+        <w:rPr>
+          <w:i/>
+          <w:iCs/>
+          <w:lang w:val="hr-HR"/>
+        </w:rPr>
+        <w:t>Geometry Nodes</w:t>
+      </w:r>
+      <w:r>
+        <w:rPr>
+          <w:lang w:val="hr-HR"/>
+        </w:rPr>
+        <w:t xml:space="preserve"> sadrži veliki broj gotovih funkcija </w:t>
+      </w:r>
+      <w:r>
+        <w:rPr>
+          <w:lang w:val="hr-HR"/>
+        </w:rPr>
+        <w:t xml:space="preserve">namijenjenih </w:t>
+      </w:r>
+      <w:r>
+        <w:rPr>
+          <w:lang w:val="hr-HR"/>
+        </w:rPr>
+        <w:t>za generiranje 3D modela, a i omogućuje korisniku da izradi svoje.</w:t>
+      </w:r>
+    </w:p>
+    <w:p>
+      <w:pPr>
+        <w:ind w:firstLine="720"/>
+        <w:rPr>
+          <w:lang w:val="hr-HR"/>
+        </w:rPr>
+      </w:pPr>
+    </w:p>
+    <w:p>
+      <w:pPr>
+        <w:ind w:firstLine="720"/>
+        <w:jc w:val="center"/>
+        <w:rPr>
+          <w:lang w:val="hr-HR"/>
+        </w:rPr>
+      </w:pPr>
+      <w:r>
+        <w:rPr>
+          <w:noProof/>
+          <w:lang w:val="hr-HR"/>
+        </w:rPr>
+        <w:drawing>
+          <wp:inline distT="0" distB="0" distL="0" distR="0" wp14:anchorId="5E176F70" wp14:editId="31BD90E2">
+            <wp:extent cx="4708478" cy="2365872"/>
+            <wp:effectExtent l="0" t="0" r="0" b="0"/>
+            <wp:docPr id="1600430670" name="Picture 1"/>
+            <wp:cNvGraphicFramePr>
+              <a:graphicFrameLocks xmlns:a="http://schemas.openxmlformats.org/drawingml/2006/main" noChangeAspect="1"/>
+            </wp:cNvGraphicFramePr>
+            <a:graphic xmlns:a="http://schemas.openxmlformats.org/drawingml/2006/main">
+              <a:graphicData uri="http://schemas.openxmlformats.org/drawingml/2006/picture">
+                <pic:pic xmlns:pic="http://schemas.openxmlformats.org/drawingml/2006/picture">
+                  <pic:nvPicPr>
+                    <pic:cNvPr id="1600430670" name="Picture 1"/>
+                    <pic:cNvPicPr/>
+                  </pic:nvPicPr>
+                  <pic:blipFill>
+                    <a:blip r:embed="rId9">
+                      <a:extLst>
+                        <a:ext uri="{28A0092B-C50C-407E-A947-70E740481C1C}">
+                          <a14:useLocalDpi xmlns:a14="http://schemas.microsoft.com/office/drawing/2010/main" val="0"/>
+                        </a:ext>
+                      </a:extLst>
+                    </a:blip>
+                    <a:stretch>
+                      <a:fillRect/>
+                    </a:stretch>
+                  </pic:blipFill>
+                  <pic:spPr>
+                    <a:xfrm>
+                      <a:off x="0" y="0"/>
+                      <a:ext cx="4804936" cy="2414339"/>
+                    </a:xfrm>
+                    <a:prstGeom prst="rect">
+                      <a:avLst/>
+                    </a:prstGeom>
+                  </pic:spPr>
+                </pic:pic>
+              </a:graphicData>
+            </a:graphic>
+          </wp:inline>
+        </w:drawing>
+      </w:r>
+    </w:p>
+    <w:p>
+      <w:pPr>
+        <w:ind w:firstLine="720"/>
+        <w:jc w:val="center"/>
+        <w:rPr>
+          <w:color w:val="808080" w:themeColor="background1" w:themeShade="80"/>
+          <w:lang w:val="hr-HR"/>
+        </w:rPr>
+      </w:pPr>
+      <w:r>
+        <w:rPr>
+          <w:color w:val="808080" w:themeColor="background1" w:themeShade="80"/>
+          <w:lang w:val="hr-HR"/>
+        </w:rPr>
+        <w:t xml:space="preserve">Slika 1: Primjer mreže čvorova alata </w:t>
+      </w:r>
+      <w:r>
+        <w:rPr>
+          <w:i/>
+          <w:iCs/>
+          <w:color w:val="808080" w:themeColor="background1" w:themeShade="80"/>
+          <w:lang w:val="hr-HR"/>
+        </w:rPr>
+        <w:t>Geometry Nodes</w:t>
+      </w:r>
+    </w:p>
+    <w:p>
+      <w:pPr>
+        <w:widowControl/>
+        <w:spacing w:line="240" w:lineRule="auto"/>
+        <w:rPr>
+          <w:lang w:val="hr-HR"/>
+        </w:rPr>
+      </w:pPr>
+      <w:r>
+        <w:rPr>
+          <w:lang w:val="hr-HR"/>
+        </w:rPr>
+        <w:br w:type="page"/>
+      </w:r>
+    </w:p>
+    <w:p>
+      <w:pPr>
+        <w:ind w:firstLine="720"/>
+        <w:jc w:val="both"/>
+        <w:rPr>
+          <w:lang w:val="hr-HR"/>
+        </w:rPr>
+      </w:pPr>
+      <w:r>
+        <w:rPr>
+          <w:lang w:val="hr-HR"/>
+        </w:rPr>
+        <w:lastRenderedPageBreak/>
+        <w:t xml:space="preserve">Prije nego što se napravi algoritam, treba analizirati problem i pronaći neke elemente koji se mogu lagano </w:t>
+      </w:r>
+      <w:r>
+        <w:rPr>
+          <w:lang w:val="hr-HR"/>
+        </w:rPr>
+        <w:t xml:space="preserve">programski </w:t>
+      </w:r>
+      <w:r>
+        <w:rPr>
+          <w:lang w:val="hr-HR"/>
+        </w:rPr>
+        <w:t>ostvariti</w:t>
+      </w:r>
+      <w:r>
+        <w:rPr>
+          <w:lang w:val="hr-HR"/>
+        </w:rPr>
+        <w:t xml:space="preserve"> tako da se taj dio posla napravi automatski. Svaka </w:t>
+      </w:r>
+      <w:r>
+        <w:rPr>
+          <w:lang w:val="hr-HR"/>
+        </w:rPr>
+        <w:t xml:space="preserve">građevina </w:t>
+      </w:r>
+      <w:r>
+        <w:rPr>
+          <w:lang w:val="hr-HR"/>
+        </w:rPr>
+        <w:t>ima</w:t>
+      </w:r>
+      <w:r>
+        <w:rPr>
+          <w:lang w:val="hr-HR"/>
+        </w:rPr>
+        <w:t xml:space="preserve"> iste elemente (prozori, ulazna vrata, boja zida,...), stoga se oni mogu </w:t>
+      </w:r>
+      <w:r>
+        <w:rPr>
+          <w:lang w:val="hr-HR"/>
+        </w:rPr>
+        <w:t xml:space="preserve">proceduralno </w:t>
+      </w:r>
+      <w:r>
+        <w:rPr>
+          <w:lang w:val="hr-HR"/>
+        </w:rPr>
+        <w:t>generirati</w:t>
+      </w:r>
+      <w:r>
+        <w:rPr>
+          <w:lang w:val="hr-HR"/>
+        </w:rPr>
+        <w:t>. Time je jedina razlika između međusobnih građevina njihov početni oblik i parametri algoritma. G</w:t>
+      </w:r>
+      <w:r>
+        <w:rPr>
+          <w:lang w:val="hr-HR"/>
+        </w:rPr>
+        <w:t xml:space="preserve">eneriranje modela građevine se svodi na </w:t>
+      </w:r>
+      <w:r>
+        <w:rPr>
+          <w:lang w:val="hr-HR"/>
+        </w:rPr>
+        <w:t>automatsko</w:t>
+      </w:r>
+      <w:r>
+        <w:rPr>
+          <w:lang w:val="hr-HR"/>
+        </w:rPr>
+        <w:t xml:space="preserve"> postavljanje detalja na površinu. </w:t>
+      </w:r>
+      <w:r>
+        <w:rPr>
+          <w:lang w:val="hr-HR"/>
+        </w:rPr>
+        <w:t xml:space="preserve">Ručno je napravljena kolekcija modela za </w:t>
+      </w:r>
+      <w:r>
+        <w:rPr>
+          <w:lang w:val="hr-HR"/>
+        </w:rPr>
+        <w:t xml:space="preserve">dodavanje </w:t>
+      </w:r>
+      <w:r>
+        <w:rPr>
+          <w:lang w:val="hr-HR"/>
+        </w:rPr>
+        <w:t>detalja građevinama</w:t>
+      </w:r>
+      <w:r>
+        <w:rPr>
+          <w:lang w:val="hr-HR"/>
+        </w:rPr>
+        <w:t xml:space="preserve"> (vidljivo na slici broj 2).</w:t>
+      </w:r>
+      <w:r>
+        <w:rPr>
+          <w:lang w:val="hr-HR"/>
+        </w:rPr>
+        <w:t xml:space="preserve"> </w:t>
+      </w:r>
+      <w:r>
+        <w:rPr>
+          <w:lang w:val="hr-HR"/>
+        </w:rPr>
+        <w:t>S</w:t>
+      </w:r>
+      <w:r>
+        <w:rPr>
+          <w:lang w:val="hr-HR"/>
+        </w:rPr>
+        <w:t xml:space="preserve">vaka vrsta detalja ima nekoliko </w:t>
+      </w:r>
+      <w:r>
+        <w:rPr>
+          <w:lang w:val="hr-HR"/>
+        </w:rPr>
+        <w:t xml:space="preserve">sličnih </w:t>
+      </w:r>
+      <w:r>
+        <w:rPr>
+          <w:lang w:val="hr-HR"/>
+        </w:rPr>
+        <w:t>alternativnih modela tako da postoji više raznolikosti među građevinama.</w:t>
+      </w:r>
+      <w:r>
+        <w:rPr>
+          <w:lang w:val="hr-HR"/>
+        </w:rPr>
+        <w:t xml:space="preserve"> Gledajući sliku 2 s lijevo na desno: uređaji za ventilaciju, dimnjaci, antene, nekoliko vrsta prozora, </w:t>
+      </w:r>
+      <w:r>
+        <w:rPr>
+          <w:lang w:val="hr-HR"/>
+        </w:rPr>
+        <w:t xml:space="preserve">dućanski </w:t>
+      </w:r>
+      <w:r>
+        <w:rPr>
+          <w:lang w:val="hr-HR"/>
+        </w:rPr>
+        <w:t>izlozi i ulazna vrata.</w:t>
+      </w:r>
+    </w:p>
+    <w:p>
+      <w:pPr>
+        <w:ind w:firstLine="720"/>
+        <w:jc w:val="center"/>
+        <w:rPr>
+          <w:lang w:val="hr-HR"/>
+        </w:rPr>
+      </w:pPr>
+      <w:r>
+        <w:rPr>
+          <w:noProof/>
+          <w:lang w:val="hr-HR"/>
+        </w:rPr>
+        <w:drawing>
+          <wp:inline distT="0" distB="0" distL="0" distR="0" wp14:anchorId="5DEA71BC" wp14:editId="108E3E3D">
+            <wp:extent cx="4067030" cy="2033516"/>
+            <wp:effectExtent l="0" t="0" r="0" b="5080"/>
+            <wp:docPr id="1132220360" name="Picture 6" descr="A screenshot of a video game&#10;&#10;AI-generated content may be incorrect."/>
+            <wp:cNvGraphicFramePr>
+              <a:graphicFrameLocks xmlns:a="http://schemas.openxmlformats.org/drawingml/2006/main" noChangeAspect="1"/>
+            </wp:cNvGraphicFramePr>
+            <a:graphic xmlns:a="http://schemas.openxmlformats.org/drawingml/2006/main">
+              <a:graphicData uri="http://schemas.openxmlformats.org/drawingml/2006/picture">
+                <pic:pic xmlns:pic="http://schemas.openxmlformats.org/drawingml/2006/picture">
+                  <pic:nvPicPr>
+                    <pic:cNvPr id="1132220360" name="Picture 6" descr="A screenshot of a video game&#10;&#10;AI-generated content may be incorrect."/>
+                    <pic:cNvPicPr/>
+                  </pic:nvPicPr>
+                  <pic:blipFill>
+                    <a:blip r:embed="rId10" cstate="print">
+                      <a:extLst>
+                        <a:ext uri="{28A0092B-C50C-407E-A947-70E740481C1C}">
+                          <a14:useLocalDpi xmlns:a14="http://schemas.microsoft.com/office/drawing/2010/main" val="0"/>
+                        </a:ext>
+                      </a:extLst>
+                    </a:blip>
+                    <a:stretch>
+                      <a:fillRect/>
+                    </a:stretch>
+                  </pic:blipFill>
+                  <pic:spPr>
+                    <a:xfrm>
+                      <a:off x="0" y="0"/>
+                      <a:ext cx="4131076" cy="2065539"/>
+                    </a:xfrm>
+                    <a:prstGeom prst="rect">
+                      <a:avLst/>
+                    </a:prstGeom>
+                  </pic:spPr>
+                </pic:pic>
+              </a:graphicData>
+            </a:graphic>
+          </wp:inline>
+        </w:drawing>
+      </w:r>
+    </w:p>
+    <w:p>
+      <w:pPr>
+        <w:ind w:firstLine="720"/>
+        <w:jc w:val="center"/>
+        <w:rPr>
+          <w:color w:val="7F7F7F" w:themeColor="text1" w:themeTint="80"/>
+          <w:lang w:val="hr-HR"/>
+        </w:rPr>
+      </w:pPr>
+      <w:r>
+        <w:rPr>
+          <w:color w:val="7F7F7F" w:themeColor="text1" w:themeTint="80"/>
+          <w:lang w:val="hr-HR"/>
+        </w:rPr>
+        <w:t xml:space="preserve">Slika </w:t>
+      </w:r>
+      <w:r>
+        <w:rPr>
+          <w:color w:val="7F7F7F" w:themeColor="text1" w:themeTint="80"/>
+          <w:lang w:val="hr-HR"/>
+        </w:rPr>
+        <w:t>2</w:t>
+      </w:r>
+      <w:r>
+        <w:rPr>
+          <w:color w:val="7F7F7F" w:themeColor="text1" w:themeTint="80"/>
+          <w:lang w:val="hr-HR"/>
+        </w:rPr>
+        <w:t>: Ručno napravljeni detalji građevina</w:t>
+      </w:r>
+    </w:p>
+    <w:p>
+      <w:pPr>
+        <w:jc w:val="both"/>
+        <w:rPr>
+          <w:lang w:val="hr-HR"/>
+        </w:rPr>
+      </w:pPr>
+    </w:p>
+    <w:p>
+      <w:pPr>
+        <w:ind w:firstLine="720"/>
+        <w:jc w:val="both"/>
+        <w:rPr>
+          <w:lang w:val="hr-HR"/>
+        </w:rPr>
+      </w:pPr>
+      <w:r>
+        <w:rPr>
+          <w:lang w:val="hr-HR"/>
+        </w:rPr>
+        <w:t>Postupak</w:t>
+      </w:r>
+      <w:r>
+        <w:rPr>
+          <w:lang w:val="hr-HR"/>
+        </w:rPr>
+        <w:t xml:space="preserve"> za </w:t>
+      </w:r>
+      <w:r>
+        <w:rPr>
+          <w:lang w:val="hr-HR"/>
+        </w:rPr>
+        <w:t xml:space="preserve">izrade nove </w:t>
+      </w:r>
+      <w:r>
+        <w:rPr>
+          <w:lang w:val="hr-HR"/>
+        </w:rPr>
+        <w:t>građevin</w:t>
+      </w:r>
+      <w:r>
+        <w:rPr>
+          <w:lang w:val="hr-HR"/>
+        </w:rPr>
+        <w:t>e</w:t>
+      </w:r>
+      <w:r>
+        <w:rPr>
+          <w:lang w:val="hr-HR"/>
+        </w:rPr>
+        <w:t xml:space="preserve"> se može podijeliti na </w:t>
+      </w:r>
+      <w:r>
+        <w:rPr>
+          <w:lang w:val="hr-HR"/>
+        </w:rPr>
+        <w:t>pet</w:t>
+      </w:r>
+      <w:r>
+        <w:rPr>
+          <w:lang w:val="hr-HR"/>
+        </w:rPr>
+        <w:t xml:space="preserve"> </w:t>
+      </w:r>
+      <w:r>
+        <w:rPr>
+          <w:lang w:val="hr-HR"/>
+        </w:rPr>
+        <w:t>koraka</w:t>
+      </w:r>
+      <w:r>
+        <w:rPr>
+          <w:lang w:val="hr-HR"/>
+        </w:rPr>
+        <w:t xml:space="preserve">. </w:t>
+      </w:r>
+      <w:r>
+        <w:rPr>
+          <w:lang w:val="hr-HR"/>
+        </w:rPr>
+        <w:t xml:space="preserve">Svi koraci su prikazani redom na slici broj </w:t>
+      </w:r>
+      <w:r>
+        <w:rPr>
+          <w:lang w:val="hr-HR"/>
+        </w:rPr>
+        <w:t>3</w:t>
+      </w:r>
+      <w:r>
+        <w:rPr>
+          <w:lang w:val="hr-HR"/>
+        </w:rPr>
+        <w:t xml:space="preserve">. </w:t>
+      </w:r>
+      <w:r>
+        <w:rPr>
+          <w:lang w:val="hr-HR"/>
+        </w:rPr>
+        <w:t>Izrada građevine započinje ručn</w:t>
+      </w:r>
+      <w:r>
+        <w:rPr>
+          <w:lang w:val="hr-HR"/>
+        </w:rPr>
+        <w:t>i</w:t>
+      </w:r>
+      <w:r>
+        <w:rPr>
+          <w:lang w:val="hr-HR"/>
+        </w:rPr>
+        <w:t xml:space="preserve">m modeliranjem njezinog osnovnog oblika (Slika </w:t>
+      </w:r>
+      <w:r>
+        <w:rPr>
+          <w:lang w:val="hr-HR"/>
+        </w:rPr>
+        <w:t>3</w:t>
+      </w:r>
+      <w:r>
+        <w:rPr>
+          <w:lang w:val="hr-HR"/>
+        </w:rPr>
+        <w:t xml:space="preserve">, </w:t>
+      </w:r>
+      <w:r>
+        <w:rPr>
+          <w:lang w:val="hr-HR"/>
+        </w:rPr>
+        <w:t>K</w:t>
+      </w:r>
+      <w:r>
+        <w:rPr>
+          <w:lang w:val="hr-HR"/>
+        </w:rPr>
+        <w:t>orak</w:t>
+      </w:r>
+      <w:r>
+        <w:rPr>
+          <w:lang w:val="hr-HR"/>
+        </w:rPr>
+        <w:t xml:space="preserve"> 1). Bitno je početnom obliku </w:t>
+      </w:r>
+      <w:r>
+        <w:rPr>
+          <w:lang w:val="hr-HR"/>
+        </w:rPr>
+        <w:t>dodati</w:t>
+      </w:r>
+      <w:r>
+        <w:rPr>
+          <w:lang w:val="hr-HR"/>
+        </w:rPr>
+        <w:t xml:space="preserve"> dovoljno geometrije</w:t>
+      </w:r>
+      <w:r>
+        <w:rPr>
+          <w:lang w:val="hr-HR"/>
+        </w:rPr>
+        <w:t xml:space="preserve"> (točaka)</w:t>
+      </w:r>
+      <w:r>
+        <w:rPr>
+          <w:lang w:val="hr-HR"/>
+        </w:rPr>
+        <w:t xml:space="preserve"> za sljedeći korak. </w:t>
+      </w:r>
+      <w:r>
+        <w:rPr>
+          <w:lang w:val="hr-HR"/>
+        </w:rPr>
+        <w:t xml:space="preserve">U sljedećem se koraku obavlja selekcija točaka na koje </w:t>
+      </w:r>
+      <w:r>
+        <w:rPr>
+          <w:lang w:val="hr-HR"/>
+        </w:rPr>
+        <w:t>ć</w:t>
+      </w:r>
+      <w:r>
+        <w:rPr>
+          <w:lang w:val="hr-HR"/>
+        </w:rPr>
+        <w:t xml:space="preserve">e se postaviti detalji građevine (Slika </w:t>
+      </w:r>
+      <w:r>
+        <w:rPr>
+          <w:lang w:val="hr-HR"/>
+        </w:rPr>
+        <w:t>3</w:t>
+      </w:r>
+      <w:r>
+        <w:rPr>
+          <w:lang w:val="hr-HR"/>
+        </w:rPr>
+        <w:t xml:space="preserve">, Korak 2). </w:t>
+      </w:r>
+      <w:r>
+        <w:rPr>
+          <w:lang w:val="hr-HR"/>
+        </w:rPr>
+        <w:t>Na temelju selekcije, algoritam postavlja detalje</w:t>
+      </w:r>
+      <w:r>
+        <w:rPr>
+          <w:lang w:val="hr-HR"/>
+        </w:rPr>
+        <w:t xml:space="preserve"> na</w:t>
+      </w:r>
+      <w:r>
+        <w:rPr>
+          <w:lang w:val="hr-HR"/>
+        </w:rPr>
+        <w:t xml:space="preserve"> površinu</w:t>
+      </w:r>
+      <w:r>
+        <w:rPr>
+          <w:lang w:val="hr-HR"/>
+        </w:rPr>
+        <w:t xml:space="preserve"> mode</w:t>
+      </w:r>
+      <w:r>
+        <w:rPr>
+          <w:lang w:val="hr-HR"/>
+        </w:rPr>
+        <w:t>la</w:t>
+      </w:r>
+      <w:r>
+        <w:rPr>
+          <w:lang w:val="hr-HR"/>
+        </w:rPr>
+        <w:t xml:space="preserve"> (Slika 2, Korak 3). Zatim se drugi i treći korak ponove za sve vrste detalja građevine (Slika </w:t>
+      </w:r>
+      <w:r>
+        <w:rPr>
+          <w:lang w:val="hr-HR"/>
+        </w:rPr>
+        <w:t>3</w:t>
+      </w:r>
+      <w:r>
+        <w:rPr>
+          <w:lang w:val="hr-HR"/>
+        </w:rPr>
+        <w:t>, Korak 4). Konačno, u parametre algoritma se navedu dvije</w:t>
+      </w:r>
+      <w:r>
+        <w:rPr>
+          <w:lang w:val="hr-HR"/>
+        </w:rPr>
+        <w:t xml:space="preserve"> </w:t>
+      </w:r>
+      <w:r>
+        <w:rPr>
+          <w:lang w:val="hr-HR"/>
+        </w:rPr>
+        <w:t xml:space="preserve">boje koje </w:t>
+      </w:r>
+      <w:r>
+        <w:rPr>
+          <w:lang w:val="hr-HR"/>
+        </w:rPr>
+        <w:t>se</w:t>
+      </w:r>
+      <w:r>
+        <w:rPr>
+          <w:lang w:val="hr-HR"/>
+        </w:rPr>
+        <w:t xml:space="preserve"> iskori</w:t>
+      </w:r>
+      <w:r>
+        <w:rPr>
+          <w:lang w:val="hr-HR"/>
+        </w:rPr>
+        <w:t xml:space="preserve">ste </w:t>
+      </w:r>
+      <w:r>
+        <w:rPr>
+          <w:lang w:val="hr-HR"/>
+        </w:rPr>
+        <w:t xml:space="preserve">za stvaranje gradijenta na površini modela (Slika </w:t>
+      </w:r>
+      <w:r>
+        <w:rPr>
+          <w:lang w:val="hr-HR"/>
+        </w:rPr>
+        <w:t>3</w:t>
+      </w:r>
+      <w:r>
+        <w:rPr>
+          <w:lang w:val="hr-HR"/>
+        </w:rPr>
+        <w:t>, Korak 5).</w:t>
+      </w:r>
+    </w:p>
+    <w:p>
+      <w:pPr>
+        <w:ind w:firstLine="720"/>
+        <w:jc w:val="center"/>
+        <w:rPr>
+          <w:lang w:val="hr-HR"/>
+        </w:rPr>
+      </w:pPr>
+      <w:r>
+        <w:rPr>
+          <w:noProof/>
+          <w:lang w:val="hr-HR"/>
+        </w:rPr>
+        <w:drawing>
+          <wp:inline distT="0" distB="0" distL="0" distR="0" wp14:anchorId="2B2A23CC" wp14:editId="7F407844">
+            <wp:extent cx="1440000" cy="1440000"/>
+            <wp:effectExtent l="0" t="0" r="0" b="8255"/>
+            <wp:docPr id="1777372314" name="Picture 1"/>
+            <wp:cNvGraphicFramePr>
+              <a:graphicFrameLocks xmlns:a="http://schemas.openxmlformats.org/drawingml/2006/main" noChangeAspect="1"/>
+            </wp:cNvGraphicFramePr>
+            <a:graphic xmlns:a="http://schemas.openxmlformats.org/drawingml/2006/main">
+              <a:graphicData uri="http://schemas.openxmlformats.org/drawingml/2006/picture">
+                <pic:pic xmlns:pic="http://schemas.openxmlformats.org/drawingml/2006/picture">
+                  <pic:nvPicPr>
+                    <pic:cNvPr id="1777372314" name="Picture 1"/>
+                    <pic:cNvPicPr/>
+                  </pic:nvPicPr>
+                  <pic:blipFill>
+                    <a:blip r:embed="rId11" cstate="print">
+                      <a:extLst>
+                        <a:ext uri="{28A0092B-C50C-407E-A947-70E740481C1C}">
+                          <a14:useLocalDpi xmlns:a14="http://schemas.microsoft.com/office/drawing/2010/main" val="0"/>
+                        </a:ext>
+                      </a:extLst>
+                    </a:blip>
+                    <a:stretch>
+                      <a:fillRect/>
+                    </a:stretch>
+                  </pic:blipFill>
+                  <pic:spPr>
+                    <a:xfrm>
+                      <a:off x="0" y="0"/>
+                      <a:ext cx="1440000" cy="1440000"/>
+                    </a:xfrm>
+                    <a:prstGeom prst="rect">
+                      <a:avLst/>
+                    </a:prstGeom>
+                  </pic:spPr>
+                </pic:pic>
+              </a:graphicData>
+            </a:graphic>
+          </wp:inline>
+        </w:drawing>
+      </w:r>
+      <w:r>
+        <w:rPr>
+          <w:noProof/>
+          <w:lang w:val="hr-HR"/>
+        </w:rPr>
+        <w:drawing>
+          <wp:inline distT="0" distB="0" distL="0" distR="0" wp14:anchorId="05830418" wp14:editId="779E019A">
+            <wp:extent cx="1440000" cy="1440000"/>
+            <wp:effectExtent l="0" t="0" r="0" b="8255"/>
+            <wp:docPr id="354170475" name="Picture 2" descr="A grey cube with black lines&#10;&#10;AI-generated content may be incorrect."/>
+            <wp:cNvGraphicFramePr>
+              <a:graphicFrameLocks xmlns:a="http://schemas.openxmlformats.org/drawingml/2006/main" noChangeAspect="1"/>
+            </wp:cNvGraphicFramePr>
+            <a:graphic xmlns:a="http://schemas.openxmlformats.org/drawingml/2006/main">
+              <a:graphicData uri="http://schemas.openxmlformats.org/drawingml/2006/picture">
+                <pic:pic xmlns:pic="http://schemas.openxmlformats.org/drawingml/2006/picture">
+                  <pic:nvPicPr>
+                    <pic:cNvPr id="354170475" name="Picture 2" descr="A grey cube with black lines&#10;&#10;AI-generated content may be incorrect."/>
+                    <pic:cNvPicPr/>
+                  </pic:nvPicPr>
+                  <pic:blipFill>
+                    <a:blip r:embed="rId12" cstate="print">
+                      <a:extLst>
+                        <a:ext uri="{28A0092B-C50C-407E-A947-70E740481C1C}">
+                          <a14:useLocalDpi xmlns:a14="http://schemas.microsoft.com/office/drawing/2010/main" val="0"/>
+                        </a:ext>
+                      </a:extLst>
+                    </a:blip>
+                    <a:stretch>
+                      <a:fillRect/>
+                    </a:stretch>
+                  </pic:blipFill>
+                  <pic:spPr>
+                    <a:xfrm>
+                      <a:off x="0" y="0"/>
+                      <a:ext cx="1440000" cy="1440000"/>
+                    </a:xfrm>
+                    <a:prstGeom prst="rect">
+                      <a:avLst/>
+                    </a:prstGeom>
+                  </pic:spPr>
+                </pic:pic>
+              </a:graphicData>
+            </a:graphic>
+          </wp:inline>
+        </w:drawing>
+      </w:r>
+      <w:r>
+        <w:rPr>
+          <w:noProof/>
+          <w:lang w:val="hr-HR"/>
+        </w:rPr>
+        <w:drawing>
+          <wp:inline distT="0" distB="0" distL="0" distR="0" wp14:anchorId="6F5B5E2F" wp14:editId="49E891B5">
+            <wp:extent cx="1440000" cy="1440000"/>
+            <wp:effectExtent l="0" t="0" r="0" b="8255"/>
+            <wp:docPr id="102163405" name="Picture 3"/>
+            <wp:cNvGraphicFramePr>
+              <a:graphicFrameLocks xmlns:a="http://schemas.openxmlformats.org/drawingml/2006/main" noChangeAspect="1"/>
+            </wp:cNvGraphicFramePr>
+            <a:graphic xmlns:a="http://schemas.openxmlformats.org/drawingml/2006/main">
+              <a:graphicData uri="http://schemas.openxmlformats.org/drawingml/2006/picture">
+                <pic:pic xmlns:pic="http://schemas.openxmlformats.org/drawingml/2006/picture">
+                  <pic:nvPicPr>
+                    <pic:cNvPr id="102163405" name="Picture 3"/>
+                    <pic:cNvPicPr/>
+                  </pic:nvPicPr>
+                  <pic:blipFill>
+                    <a:blip r:embed="rId13" cstate="print">
+                      <a:extLst>
+                        <a:ext uri="{28A0092B-C50C-407E-A947-70E740481C1C}">
+                          <a14:useLocalDpi xmlns:a14="http://schemas.microsoft.com/office/drawing/2010/main" val="0"/>
+                        </a:ext>
+                      </a:extLst>
+                    </a:blip>
+                    <a:stretch>
+                      <a:fillRect/>
+                    </a:stretch>
+                  </pic:blipFill>
+                  <pic:spPr>
+                    <a:xfrm>
+                      <a:off x="0" y="0"/>
+                      <a:ext cx="1440000" cy="1440000"/>
+                    </a:xfrm>
+                    <a:prstGeom prst="rect">
+                      <a:avLst/>
+                    </a:prstGeom>
+                  </pic:spPr>
+                </pic:pic>
+              </a:graphicData>
+            </a:graphic>
+          </wp:inline>
+        </w:drawing>
+      </w:r>
+    </w:p>
+    <w:p>
+      <w:pPr>
+        <w:ind w:firstLine="720"/>
+        <w:jc w:val="center"/>
+        <w:rPr>
+          <w:lang w:val="hr-HR"/>
+        </w:rPr>
+      </w:pPr>
+      <w:r>
+        <w:rPr>
+          <w:noProof/>
+          <w:lang w:val="hr-HR"/>
+        </w:rPr>
+        <mc:AlternateContent>
+          <mc:Choice Requires="wps">
+            <w:drawing>
+              <wp:inline distT="0" distB="0" distL="0" distR="0" wp14:anchorId="2BC1A1C0" wp14:editId="61CE7EEF">
+                <wp:extent cx="1440000" cy="1404620"/>
+                <wp:effectExtent l="0" t="0" r="0" b="3810"/>
+                <wp:docPr id="1534645229" name="Text Box 2"/>
+                <wp:cNvGraphicFramePr>
+                  <a:graphicFrameLocks xmlns:a="http://schemas.openxmlformats.org/drawingml/2006/main"/>
+                </wp:cNvGraphicFramePr>
+                <a:graphic xmlns:a="http://schemas.openxmlformats.org/drawingml/2006/main">
+                  <a:graphicData uri="http://schemas.microsoft.com/office/word/2010/wordprocessingShape">
+                    <wps:wsp>
+                      <wps:cNvSpPr txBox="1">
+                        <a:spLocks noChangeArrowheads="1"/>
+                      </wps:cNvSpPr>
+                      <wps:spPr bwMode="auto">
+                        <a:xfrm>
+                          <a:off x="0" y="0"/>
+                          <a:ext cx="1440000" cy="1404620"/>
+                        </a:xfrm>
+                        <a:prstGeom prst="rect">
+                          <a:avLst/>
+                        </a:prstGeom>
+                        <a:noFill/>
+                        <a:ln>
+                          <a:noFill/>
+                        </a:ln>
+                      </wps:spPr>
+                      <wps:style>
+                        <a:lnRef idx="0">
+                          <a:scrgbClr r="0" g="0" b="0"/>
+                        </a:lnRef>
+                        <a:fillRef idx="0">
+                          <a:scrgbClr r="0" g="0" b="0"/>
+                        </a:fillRef>
+                        <a:effectRef idx="0">
+                          <a:scrgbClr r="0" g="0" b="0"/>
+                        </a:effectRef>
+                        <a:fontRef idx="minor">
+                          <a:schemeClr val="dk1"/>
+                        </a:fontRef>
+                      </wps:style>
+                      <wps:txbx>
+                        <w:txbxContent>
+                          <w:p>
+                            <w:pPr>
+                              <w:jc w:val="center"/>
+                            </w:pPr>
+                            <w:r>
+                              <w:t>Korak 1</w:t>
+                            </w:r>
+                          </w:p>
+                        </w:txbxContent>
+                      </wps:txbx>
+                      <wps:bodyPr rot="0" vert="horz" wrap="square" lIns="91440" tIns="45720" rIns="91440" bIns="45720" anchor="t" anchorCtr="0">
+                        <a:spAutoFit/>
+                      </wps:bodyPr>
+                    </wps:wsp>
+                  </a:graphicData>
+                </a:graphic>
+              </wp:inline>
+            </w:drawing>
+          </mc:Choice>
+          <mc:Fallback>
+            <w:pict>
+              <v:shapetype w14:anchorId="2BC1A1C0" id="_x0000_t202" coordsize="21600,21600" o:spt="202" path="m,l,21600r21600,l21600,xe">
+                <v:stroke joinstyle="miter"/>
+                <v:path gradientshapeok="t" o:connecttype="rect"/>
+              </v:shapetype>
+              <v:shape id="Text Box 2" o:spid="_x0000_s1026" type="#_x0000_t202" style="width:113.4pt;height:110.6pt;visibility:visible;mso-wrap-style:square;mso-left-percent:-10001;mso-top-percent:-10001;mso-position-horizontal:absolute;mso-position-horizontal-relative:char;mso-position-vertical:absolute;mso-position-vertical-relative:line;mso-left-percent:-10001;mso-top-percent:-10001;v-text-anchor:top" o:gfxdata="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" filled="f" stroked="f">
+                <v:textbox style="mso-fit-shape-to-text:t">
+                  <w:txbxContent>
+                    <w:p>
+                      <w:pPr>
+                        <w:jc w:val="center"/>
+                      </w:pPr>
+                      <w:r>
+                        <w:t>Korak 1</w:t>
+                      </w:r>
+                    </w:p>
+                  </w:txbxContent>
+                </v:textbox>
+                <w10:anchorlock/>
+              </v:shape>
+            </w:pict>
+          </mc:Fallback>
+        </mc:AlternateContent>
+      </w:r>
+      <w:r>
+        <w:rPr>
+          <w:noProof/>
+          <w:lang w:val="hr-HR"/>
+        </w:rPr>
+        <mc:AlternateContent>
+          <mc:Choice Requires="wps">
+            <w:drawing>
+              <wp:inline distT="0" distB="0" distL="0" distR="0" wp14:anchorId="25B8BF31" wp14:editId="1A94945C">
+                <wp:extent cx="1440000" cy="1404620"/>
+                <wp:effectExtent l="0" t="0" r="0" b="3810"/>
+                <wp:docPr id="40770246" name="Text Box 2"/>
+                <wp:cNvGraphicFramePr>
+                  <a:graphicFrameLocks xmlns:a="http://schemas.openxmlformats.org/drawingml/2006/main"/>
+                </wp:cNvGraphicFramePr>
+                <a:graphic xmlns:a="http://schemas.openxmlformats.org/drawingml/2006/main">
+                  <a:graphicData uri="http://schemas.microsoft.com/office/word/2010/wordprocessingShape">
+                    <wps:wsp>
+                      <wps:cNvSpPr txBox="1">
+                        <a:spLocks noChangeArrowheads="1"/>
+                      </wps:cNvSpPr>
+                      <wps:spPr bwMode="auto">
+                        <a:xfrm>
+                          <a:off x="0" y="0"/>
+                          <a:ext cx="1440000" cy="1404620"/>
+                        </a:xfrm>
+                        <a:prstGeom prst="rect">
+                          <a:avLst/>
+                        </a:prstGeom>
+                        <a:noFill/>
+                        <a:ln>
+                          <a:noFill/>
+                        </a:ln>
+                      </wps:spPr>
+                      <wps:style>
+                        <a:lnRef idx="0">
+                          <a:scrgbClr r="0" g="0" b="0"/>
+                        </a:lnRef>
+                        <a:fillRef idx="0">
+                          <a:scrgbClr r="0" g="0" b="0"/>
+                        </a:fillRef>
+                        <a:effectRef idx="0">
+                          <a:scrgbClr r="0" g="0" b="0"/>
+                        </a:effectRef>
+                        <a:fontRef idx="minor">
+                          <a:schemeClr val="dk1"/>
+                        </a:fontRef>
+                      </wps:style>
+                      <wps:txbx>
+                        <w:txbxContent>
+                          <w:p>
+                            <w:pPr>
+                              <w:jc w:val="center"/>
+                            </w:pPr>
+                            <w:r>
+                              <w:t>Korak 2</w:t>
+                            </w:r>
+                          </w:p>
+                        </w:txbxContent>
+                      </wps:txbx>
+                      <wps:bodyPr rot="0" vert="horz" wrap="square" lIns="91440" tIns="45720" rIns="91440" bIns="45720" anchor="t" anchorCtr="0">
+                        <a:spAutoFit/>
+                      </wps:bodyPr>
+                    </wps:wsp>
+                  </a:graphicData>
+                </a:graphic>
+              </wp:inline>
+            </w:drawing>
+          </mc:Choice>
+          <mc:Fallback>
+            <w:pict>
+              <v:shape w14:anchorId="25B8BF31" id="_x0000_s1027" type="#_x0000_t202" style="width:113.4pt;height:110.6pt;visibility:visible;mso-wrap-style:square;mso-left-percent:-10001;mso-top-percent:-10001;mso-position-horizontal:absolute;mso-position-horizontal-relative:char;mso-position-vertical:absolute;mso-position-vertical-relative:line;mso-left-percent:-10001;mso-top-percent:-10001;v-text-anchor:top" o:gfxdata="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" filled="f" stroked="f">
+                <v:textbox style="mso-fit-shape-to-text:t">
+                  <w:txbxContent>
+                    <w:p>
+                      <w:pPr>
+                        <w:jc w:val="center"/>
+                      </w:pPr>
+                      <w:r>
+                        <w:t>Korak 2</w:t>
+                      </w:r>
+                    </w:p>
+                  </w:txbxContent>
+                </v:textbox>
+                <w10:anchorlock/>
+              </v:shape>
+            </w:pict>
+          </mc:Fallback>
+        </mc:AlternateContent>
+      </w:r>
+      <w:r>
+        <w:rPr>
+          <w:noProof/>
+          <w:lang w:val="hr-HR"/>
+        </w:rPr>
+        <mc:AlternateContent>
+          <mc:Choice Requires="wps">
+            <w:drawing>
+              <wp:inline distT="0" distB="0" distL="0" distR="0" wp14:anchorId="2978B7DD" wp14:editId="509745C1">
+                <wp:extent cx="1440000" cy="1404620"/>
+                <wp:effectExtent l="0" t="0" r="0" b="3810"/>
+                <wp:docPr id="806557320" name="Text Box 2"/>
+                <wp:cNvGraphicFramePr>
+                  <a:graphicFrameLocks xmlns:a="http://schemas.openxmlformats.org/drawingml/2006/main"/>
+                </wp:cNvGraphicFramePr>
+                <a:graphic xmlns:a="http://schemas.openxmlformats.org/drawingml/2006/main">
+                  <a:graphicData uri="http://schemas.microsoft.com/office/word/2010/wordprocessingShape">
+                    <wps:wsp>
+                      <wps:cNvSpPr txBox="1">
+                        <a:spLocks noChangeArrowheads="1"/>
+                      </wps:cNvSpPr>
+                      <wps:spPr bwMode="auto">
+                        <a:xfrm>
+                          <a:off x="0" y="0"/>
+                          <a:ext cx="1440000" cy="1404620"/>
+                        </a:xfrm>
+                        <a:prstGeom prst="rect">
+                          <a:avLst/>
+                        </a:prstGeom>
+                        <a:noFill/>
+                        <a:ln>
+                          <a:noFill/>
+                        </a:ln>
+                      </wps:spPr>
+                      <wps:style>
+                        <a:lnRef idx="0">
+                          <a:scrgbClr r="0" g="0" b="0"/>
+                        </a:lnRef>
+                        <a:fillRef idx="0">
+                          <a:scrgbClr r="0" g="0" b="0"/>
+                        </a:fillRef>
+                        <a:effectRef idx="0">
+                          <a:scrgbClr r="0" g="0" b="0"/>
+                        </a:effectRef>
+                        <a:fontRef idx="minor">
+                          <a:schemeClr val="dk1"/>
+                        </a:fontRef>
+                      </wps:style>
+                      <wps:txbx>
+                        <w:txbxContent>
+                          <w:p>
+                            <w:pPr>
+                              <w:jc w:val="center"/>
+                            </w:pPr>
+                            <w:r>
+                              <w:t>Korak 3</w:t>
+                            </w:r>
+                          </w:p>
+                        </w:txbxContent>
+                      </wps:txbx>
+                      <wps:bodyPr rot="0" vert="horz" wrap="square" lIns="91440" tIns="45720" rIns="91440" bIns="45720" anchor="t" anchorCtr="0">
+                        <a:spAutoFit/>
+                      </wps:bodyPr>
+                    </wps:wsp>
+                  </a:graphicData>
+                </a:graphic>
+              </wp:inline>
+            </w:drawing>
+          </mc:Choice>
+          <mc:Fallback>
+            <w:pict>
+              <v:shape w14:anchorId="2978B7DD" id="_x0000_s1028" type="#_x0000_t202" style="width:113.4pt;height:110.6pt;visibility:visible;mso-wrap-style:square;mso-left-percent:-10001;mso-top-percent:-10001;mso-position-horizontal:absolute;mso-position-horizontal-relative:char;mso-position-vertical:absolute;mso-position-vertical-relative:line;mso-left-percent:-10001;mso-top-percent:-10001;v-text-anchor:top" o:gfxdata="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" filled="f" stroked="f">
+                <v:textbox style="mso-fit-shape-to-text:t">
+                  <w:txbxContent>
+                    <w:p>
+                      <w:pPr>
+                        <w:jc w:val="center"/>
+                      </w:pPr>
+                      <w:r>
+                        <w:t>Korak 3</w:t>
+                      </w:r>
+                    </w:p>
+                  </w:txbxContent>
+                </v:textbox>
+                <w10:anchorlock/>
+              </v:shape>
+            </w:pict>
+          </mc:Fallback>
+        </mc:AlternateContent>
+      </w:r>
+    </w:p>
+    <w:p>
+      <w:pPr>
+        <w:ind w:firstLine="720"/>
+        <w:jc w:val="center"/>
+        <w:rPr>
+          <w:lang w:val="hr-HR"/>
+        </w:rPr>
+      </w:pPr>
+      <w:r>
+        <w:rPr>
+          <w:noProof/>
+          <w:lang w:val="hr-HR"/>
+        </w:rPr>
+        <w:drawing>
+          <wp:inline distT="0" distB="0" distL="0" distR="0" wp14:anchorId="388D1BE1" wp14:editId="58F900C3">
+            <wp:extent cx="1440000" cy="1440000"/>
+            <wp:effectExtent l="0" t="0" r="0" b="8255"/>
+            <wp:docPr id="976102800" name="Picture 4"/>
+            <wp:cNvGraphicFramePr>
+              <a:graphicFrameLocks xmlns:a="http://schemas.openxmlformats.org/drawingml/2006/main" noChangeAspect="1"/>
+            </wp:cNvGraphicFramePr>
+            <a:graphic xmlns:a="http://schemas.openxmlformats.org/drawingml/2006/main">
+              <a:graphicData uri="http://schemas.openxmlformats.org/drawingml/2006/picture">
+                <pic:pic xmlns:pic="http://schemas.openxmlformats.org/drawingml/2006/picture">
+                  <pic:nvPicPr>
+                    <pic:cNvPr id="976102800" name="Picture 4"/>
+                    <pic:cNvPicPr/>
+                  </pic:nvPicPr>
+                  <pic:blipFill>
+                    <a:blip r:embed="rId14" cstate="print">
+                      <a:extLst>
+                        <a:ext uri="{28A0092B-C50C-407E-A947-70E740481C1C}">
+                          <a14:useLocalDpi xmlns:a14="http://schemas.microsoft.com/office/drawing/2010/main" val="0"/>
+                        </a:ext>
+                      </a:extLst>
+                    </a:blip>
+                    <a:stretch>
+                      <a:fillRect/>
+                    </a:stretch>
+                  </pic:blipFill>
+                  <pic:spPr>
+                    <a:xfrm>
+                      <a:off x="0" y="0"/>
+                      <a:ext cx="1440000" cy="1440000"/>
+                    </a:xfrm>
+                    <a:prstGeom prst="rect">
+                      <a:avLst/>
+                    </a:prstGeom>
+                  </pic:spPr>
+                </pic:pic>
+              </a:graphicData>
+            </a:graphic>
+          </wp:inline>
+        </w:drawing>
+      </w:r>
+      <w:r>
+        <w:rPr>
+          <w:noProof/>
+          <w:lang w:val="hr-HR"/>
+        </w:rPr>
+        <w:drawing>
+          <wp:inline distT="0" distB="0" distL="0" distR="0" wp14:anchorId="53072C21" wp14:editId="4C5DC5EA">
+            <wp:extent cx="1440000" cy="1440000"/>
+            <wp:effectExtent l="0" t="0" r="0" b="8255"/>
+            <wp:docPr id="1164210996" name="Picture 5" descr="A cartoon building with windows&#10;&#10;AI-generated content may be incorrect."/>
+            <wp:cNvGraphicFramePr>
+              <a:graphicFrameLocks xmlns:a="http://schemas.openxmlformats.org/drawingml/2006/main" noChangeAspect="1"/>
+            </wp:cNvGraphicFramePr>
+            <a:graphic xmlns:a="http://schemas.openxmlformats.org/drawingml/2006/main">
+              <a:graphicData uri="http://schemas.openxmlformats.org/drawingml/2006/picture">
+                <pic:pic xmlns:pic="http://schemas.openxmlformats.org/drawingml/2006/picture">
+                  <pic:nvPicPr>
+                    <pic:cNvPr id="1164210996" name="Picture 5" descr="A cartoon building with windows&#10;&#10;AI-generated content may be incorrect."/>
+                    <pic:cNvPicPr/>
+                  </pic:nvPicPr>
+                  <pic:blipFill>
+                    <a:blip r:embed="rId15" cstate="print">
+                      <a:extLst>
+                        <a:ext uri="{28A0092B-C50C-407E-A947-70E740481C1C}">
+                          <a14:useLocalDpi xmlns:a14="http://schemas.microsoft.com/office/drawing/2010/main" val="0"/>
+                        </a:ext>
+                      </a:extLst>
+                    </a:blip>
+                    <a:stretch>
+                      <a:fillRect/>
+                    </a:stretch>
+                  </pic:blipFill>
+                  <pic:spPr>
+                    <a:xfrm>
+                      <a:off x="0" y="0"/>
+                      <a:ext cx="1440000" cy="1440000"/>
+                    </a:xfrm>
+                    <a:prstGeom prst="rect">
+                      <a:avLst/>
+                    </a:prstGeom>
+                  </pic:spPr>
+                </pic:pic>
+              </a:graphicData>
+            </a:graphic>
+          </wp:inline>
+        </w:drawing>
+      </w:r>
+    </w:p>
+    <w:p>
+      <w:pPr>
+        <w:ind w:firstLine="720"/>
+        <w:jc w:val="center"/>
+        <w:rPr>
+          <w:lang w:val="hr-HR"/>
+        </w:rPr>
+      </w:pPr>
+      <w:r>
+        <w:rPr>
+          <w:noProof/>
+          <w:lang w:val="hr-HR"/>
+        </w:rPr>
+        <mc:AlternateContent>
+          <mc:Choice Requires="wps">
+            <w:drawing>
+              <wp:inline distT="0" distB="0" distL="0" distR="0" wp14:anchorId="659C2D97" wp14:editId="1735E970">
+                <wp:extent cx="1440000" cy="1404620"/>
+                <wp:effectExtent l="0" t="0" r="0" b="3810"/>
+                <wp:docPr id="777997175" name="Text Box 2"/>
+                <wp:cNvGraphicFramePr>
+                  <a:graphicFrameLocks xmlns:a="http://schemas.openxmlformats.org/drawingml/2006/main"/>
+                </wp:cNvGraphicFramePr>
+                <a:graphic xmlns:a="http://schemas.openxmlformats.org/drawingml/2006/main">
+                  <a:graphicData uri="http://schemas.microsoft.com/office/word/2010/wordprocessingShape">
+                    <wps:wsp>
+                      <wps:cNvSpPr txBox="1">
+                        <a:spLocks noChangeArrowheads="1"/>
+                      </wps:cNvSpPr>
+                      <wps:spPr bwMode="auto">
+                        <a:xfrm>
+                          <a:off x="0" y="0"/>
+                          <a:ext cx="1440000" cy="1404620"/>
+                        </a:xfrm>
+                        <a:prstGeom prst="rect">
+                          <a:avLst/>
+                        </a:prstGeom>
+                        <a:noFill/>
+                        <a:ln>
+                          <a:noFill/>
+                        </a:ln>
+                      </wps:spPr>
+                      <wps:style>
+                        <a:lnRef idx="0">
+                          <a:scrgbClr r="0" g="0" b="0"/>
+                        </a:lnRef>
+                        <a:fillRef idx="0">
+                          <a:scrgbClr r="0" g="0" b="0"/>
+                        </a:fillRef>
+                        <a:effectRef idx="0">
+                          <a:scrgbClr r="0" g="0" b="0"/>
+                        </a:effectRef>
+                        <a:fontRef idx="minor">
+                          <a:schemeClr val="dk1"/>
+                        </a:fontRef>
+                      </wps:style>
+                      <wps:txbx>
+                        <w:txbxContent>
+                          <w:p>
+                            <w:pPr>
+                              <w:jc w:val="center"/>
+                            </w:pPr>
+                            <w:r>
+                              <w:t>Korak 4</w:t>
+                            </w:r>
+                          </w:p>
+                        </w:txbxContent>
+                      </wps:txbx>
+                      <wps:bodyPr rot="0" vert="horz" wrap="square" lIns="91440" tIns="45720" rIns="91440" bIns="45720" anchor="t" anchorCtr="0">
+                        <a:spAutoFit/>
+                      </wps:bodyPr>
+                    </wps:wsp>
+                  </a:graphicData>
+                </a:graphic>
+              </wp:inline>
+            </w:drawing>
+          </mc:Choice>
+          <mc:Fallback>
+            <w:pict>
+              <v:shape w14:anchorId="659C2D97" id="_x0000_s1029" type="#_x0000_t202" style="width:113.4pt;height:110.6pt;visibility:visible;mso-wrap-style:square;mso-left-percent:-10001;mso-top-percent:-10001;mso-position-horizontal:absolute;mso-position-horizontal-relative:char;mso-position-vertical:absolute;mso-position-vertical-relative:line;mso-left-percent:-10001;mso-top-percent:-10001;v-text-anchor:top" o:gfxdata="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" filled="f" stroked="f">
+                <v:textbox style="mso-fit-shape-to-text:t">
+                  <w:txbxContent>
+                    <w:p>
+                      <w:pPr>
+                        <w:jc w:val="center"/>
+                      </w:pPr>
+                      <w:r>
+                        <w:t>Korak 4</w:t>
+                      </w:r>
+                    </w:p>
+                  </w:txbxContent>
+                </v:textbox>
+                <w10:anchorlock/>
+              </v:shape>
+            </w:pict>
+          </mc:Fallback>
+        </mc:AlternateContent>
+      </w:r>
+      <w:r>
+        <w:rPr>
+          <w:noProof/>
+          <w:lang w:val="hr-HR"/>
+        </w:rPr>
+        <mc:AlternateContent>
+          <mc:Choice Requires="wps">
+            <w:drawing>
+              <wp:inline distT="0" distB="0" distL="0" distR="0" wp14:anchorId="4D9F7A61" wp14:editId="3652CE59">
+                <wp:extent cx="1440000" cy="1404620"/>
+                <wp:effectExtent l="0" t="0" r="0" b="3810"/>
+                <wp:docPr id="217" name="Text Box 2"/>
+                <wp:cNvGraphicFramePr>
+                  <a:graphicFrameLocks xmlns:a="http://schemas.openxmlformats.org/drawingml/2006/main"/>
+                </wp:cNvGraphicFramePr>
+                <a:graphic xmlns:a="http://schemas.openxmlformats.org/drawingml/2006/main">
+                  <a:graphicData uri="http://schemas.microsoft.com/office/word/2010/wordprocessingShape">
+                    <wps:wsp>
+                      <wps:cNvSpPr txBox="1">
+                        <a:spLocks noChangeArrowheads="1"/>
+                      </wps:cNvSpPr>
+                      <wps:spPr bwMode="auto">
+                        <a:xfrm>
+                          <a:off x="0" y="0"/>
+                          <a:ext cx="1440000" cy="1404620"/>
+                        </a:xfrm>
+                        <a:prstGeom prst="rect">
+                          <a:avLst/>
+                        </a:prstGeom>
+                        <a:noFill/>
+                        <a:ln>
+                          <a:noFill/>
+                        </a:ln>
+                      </wps:spPr>
+                      <wps:style>
+                        <a:lnRef idx="0">
+                          <a:scrgbClr r="0" g="0" b="0"/>
+                        </a:lnRef>
+                        <a:fillRef idx="0">
+                          <a:scrgbClr r="0" g="0" b="0"/>
+                        </a:fillRef>
+                        <a:effectRef idx="0">
+                          <a:scrgbClr r="0" g="0" b="0"/>
+                        </a:effectRef>
+                        <a:fontRef idx="minor">
+                          <a:schemeClr val="dk1"/>
+                        </a:fontRef>
+                      </wps:style>
+                      <wps:txbx>
+                        <w:txbxContent>
+                          <w:p>
+                            <w:pPr>
+                              <w:jc w:val="center"/>
+                            </w:pPr>
+                            <w:r>
+                              <w:t>Korak 5</w:t>
+                            </w:r>
+                          </w:p>
+                        </w:txbxContent>
+                      </wps:txbx>
+                      <wps:bodyPr rot="0" vert="horz" wrap="square" lIns="91440" tIns="45720" rIns="91440" bIns="45720" anchor="t" anchorCtr="0">
+                        <a:spAutoFit/>
+                      </wps:bodyPr>
+                    </wps:wsp>
+                  </a:graphicData>
+                </a:graphic>
+              </wp:inline>
+            </w:drawing>
+          </mc:Choice>
+          <mc:Fallback>
+            <w:pict>
+              <v:shape w14:anchorId="4D9F7A61" id="_x0000_s1030" type="#_x0000_t202" style="width:113.4pt;height:110.6pt;visibility:visible;mso-wrap-style:square;mso-left-percent:-10001;mso-top-percent:-10001;mso-position-horizontal:absolute;mso-position-horizontal-relative:char;mso-position-vertical:absolute;mso-position-vertical-relative:line;mso-left-percent:-10001;mso-top-percent:-10001;v-text-anchor:top" o:gfxdata="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" filled="f" stroked="f">
+                <v:textbox style="mso-fit-shape-to-text:t">
+                  <w:txbxContent>
+                    <w:p>
+                      <w:pPr>
+                        <w:jc w:val="center"/>
+                      </w:pPr>
+                      <w:r>
+                        <w:t>Korak 5</w:t>
+                      </w:r>
+                    </w:p>
+                  </w:txbxContent>
+                </v:textbox>
+                <w10:anchorlock/>
+              </v:shape>
+            </w:pict>
+          </mc:Fallback>
+        </mc:AlternateContent>
+      </w:r>
+    </w:p>
+    <w:p>
+      <w:pPr>
+        <w:ind w:firstLine="720"/>
+        <w:jc w:val="center"/>
+        <w:rPr>
+          <w:color w:val="7F7F7F" w:themeColor="text1" w:themeTint="80"/>
+          <w:lang w:val="hr-HR"/>
+        </w:rPr>
+      </w:pPr>
+      <w:r>
+        <w:rPr>
+          <w:color w:val="7F7F7F" w:themeColor="text1" w:themeTint="80"/>
+          <w:lang w:val="hr-HR"/>
+        </w:rPr>
+        <w:t xml:space="preserve">Slika </w:t>
+      </w:r>
+      <w:r>
+        <w:rPr>
+          <w:color w:val="7F7F7F" w:themeColor="text1" w:themeTint="80"/>
+          <w:lang w:val="hr-HR"/>
+        </w:rPr>
+        <w:t>3</w:t>
+      </w:r>
+      <w:r>
+        <w:rPr>
+          <w:color w:val="7F7F7F" w:themeColor="text1" w:themeTint="80"/>
+          <w:lang w:val="hr-HR"/>
+        </w:rPr>
+        <w:t xml:space="preserve">: </w:t>
+      </w:r>
+      <w:r>
+        <w:rPr>
+          <w:color w:val="7F7F7F" w:themeColor="text1" w:themeTint="80"/>
+          <w:lang w:val="hr-HR"/>
+        </w:rPr>
+        <w:t>Postupak</w:t>
+      </w:r>
+      <w:r>
+        <w:rPr>
+          <w:color w:val="7F7F7F" w:themeColor="text1" w:themeTint="80"/>
+          <w:lang w:val="hr-HR"/>
+        </w:rPr>
+        <w:t xml:space="preserve"> izrade i generiranja modela građevine</w:t>
+      </w:r>
+    </w:p>
+    <w:p>
+      <w:pPr>
+        <w:widowControl/>
+        <w:spacing w:line="240" w:lineRule="auto"/>
+        <w:rPr>
+          <w:color w:val="7F7F7F" w:themeColor="text1" w:themeTint="80"/>
+          <w:lang w:val="hr-HR"/>
+        </w:rPr>
+      </w:pPr>
+      <w:r>
+        <w:rPr>
+          <w:color w:val="7F7F7F" w:themeColor="text1" w:themeTint="80"/>
+          <w:lang w:val="hr-HR"/>
+        </w:rPr>
+        <w:br w:type="page"/>
       </w:r>
     </w:p>
     <w:p>
@@ -2797,31 +4516,364 @@
         <w:rPr>
           <w:lang w:val="hr-HR"/>
         </w:rPr>
-        <w:t>Dizajn levela</w:t>
+        <w:lastRenderedPageBreak/>
+        <w:t>Diz</w:t>
+      </w:r>
+      <w:r>
+        <w:rPr>
+          <w:lang w:val="hr-HR"/>
+        </w:rPr>
+        <w:t>ajn levela</w:t>
       </w:r>
       <w:bookmarkEnd w:id="8"/>
     </w:p>
     <w:p>
       <w:pPr>
-        <w:ind w:firstLine="720"/>
-        <w:rPr>
-          <w:lang w:val="hr-HR"/>
-        </w:rPr>
-      </w:pPr>
-      <w:r>
-        <w:rPr>
-          <w:lang w:val="hr-HR"/>
-        </w:rPr>
-        <w:t>[opisati grid raspored grada, opis rasporeda grada]</w:t>
-      </w:r>
-    </w:p>
-    <w:p>
-      <w:pPr>
         <w:pStyle w:val="BodyText"/>
-        <w:rPr>
-          <w:lang w:val="hr-HR"/>
-        </w:rPr>
-      </w:pPr>
+        <w:ind w:left="0" w:firstLine="720"/>
+        <w:jc w:val="both"/>
+        <w:rPr>
+          <w:lang w:val="hr-HR"/>
+        </w:rPr>
+      </w:pPr>
+    </w:p>
+    <w:p>
+      <w:pPr>
+        <w:pStyle w:val="BodyText"/>
+        <w:ind w:left="0" w:firstLine="720"/>
+        <w:jc w:val="both"/>
+        <w:rPr>
+          <w:lang w:val="hr-HR"/>
+        </w:rPr>
+      </w:pPr>
+      <w:r>
+        <w:rPr>
+          <w:lang w:val="hr-HR"/>
+        </w:rPr>
+        <w:t xml:space="preserve">Level </w:t>
+      </w:r>
+      <w:r>
+        <w:rPr>
+          <w:lang w:val="hr-HR"/>
+        </w:rPr>
+        <w:t xml:space="preserve">u Dron.co je </w:t>
+      </w:r>
+      <w:r>
+        <w:rPr>
+          <w:lang w:val="hr-HR"/>
+        </w:rPr>
+        <w:t>stiliziran</w:t>
+      </w:r>
+      <w:r>
+        <w:rPr>
+          <w:lang w:val="hr-HR"/>
+        </w:rPr>
+        <w:t>i</w:t>
+      </w:r>
+      <w:r>
+        <w:rPr>
+          <w:lang w:val="hr-HR"/>
+        </w:rPr>
+        <w:t xml:space="preserve"> grad. Za izgradnju grada je korišten alat </w:t>
+      </w:r>
+      <w:r>
+        <w:rPr>
+          <w:i/>
+          <w:iCs/>
+          <w:lang w:val="hr-HR"/>
+        </w:rPr>
+        <w:t>GridMap</w:t>
+      </w:r>
+      <w:r>
+        <w:rPr>
+          <w:lang w:val="hr-HR"/>
+        </w:rPr>
+        <w:t xml:space="preserve"> unutar </w:t>
+      </w:r>
+      <w:r>
+        <w:rPr>
+          <w:i/>
+          <w:iCs/>
+          <w:lang w:val="hr-HR"/>
+        </w:rPr>
+        <w:t>Godot</w:t>
+      </w:r>
+      <w:r>
+        <w:rPr>
+          <w:lang w:val="hr-HR"/>
+        </w:rPr>
+        <w:t>.</w:t>
+      </w:r>
+      <w:r>
+        <w:rPr>
+          <w:lang w:val="hr-HR"/>
+        </w:rPr>
+        <w:t xml:space="preserve"> </w:t>
+      </w:r>
+      <w:r>
+        <w:rPr>
+          <w:i/>
+          <w:iCs/>
+          <w:lang w:val="hr-HR"/>
+        </w:rPr>
+        <w:t>GridMap</w:t>
+      </w:r>
+      <w:r>
+        <w:rPr>
+          <w:lang w:val="hr-HR"/>
+        </w:rPr>
+        <w:t xml:space="preserve"> služi za </w:t>
+      </w:r>
+      <w:r>
+        <w:rPr>
+          <w:lang w:val="hr-HR"/>
+        </w:rPr>
+        <w:t>efikasno popunjavanje velikih prostora ponavljajućim modularnim dijelovima</w:t>
+      </w:r>
+      <w:r>
+        <w:rPr>
+          <w:lang w:val="hr-HR"/>
+        </w:rPr>
+        <w:t xml:space="preserve">. </w:t>
+      </w:r>
+      <w:r>
+        <w:rPr>
+          <w:lang w:val="hr-HR"/>
+        </w:rPr>
+        <w:t>G</w:t>
+      </w:r>
+      <w:r>
+        <w:rPr>
+          <w:lang w:val="hr-HR"/>
+        </w:rPr>
+        <w:t>lavne prednosti</w:t>
+      </w:r>
+      <w:r>
+        <w:rPr>
+          <w:lang w:val="hr-HR"/>
+        </w:rPr>
+        <w:t xml:space="preserve"> korištenja alata</w:t>
+      </w:r>
+      <w:r>
+        <w:rPr>
+          <w:lang w:val="hr-HR"/>
+        </w:rPr>
+        <w:t xml:space="preserve"> u odnosu na klasično ručno postavljanje modela</w:t>
+      </w:r>
+      <w:r>
+        <w:rPr>
+          <w:lang w:val="hr-HR"/>
+        </w:rPr>
+        <w:t xml:space="preserve"> u scenu</w:t>
+      </w:r>
+      <w:r>
+        <w:rPr>
+          <w:lang w:val="hr-HR"/>
+        </w:rPr>
+        <w:t xml:space="preserve"> su znatno brž</w:t>
+      </w:r>
+      <w:r>
+        <w:rPr>
+          <w:lang w:val="hr-HR"/>
+        </w:rPr>
+        <w:t>a</w:t>
+      </w:r>
+      <w:r>
+        <w:rPr>
+          <w:lang w:val="hr-HR"/>
+        </w:rPr>
+        <w:t xml:space="preserve"> izgradnja i iteracija levela, automatsko</w:t>
+      </w:r>
+      <w:r>
+        <w:rPr>
+          <w:lang w:val="hr-HR"/>
+        </w:rPr>
+        <w:t xml:space="preserve"> </w:t>
+      </w:r>
+      <w:r>
+        <w:rPr>
+          <w:lang w:val="hr-HR"/>
+        </w:rPr>
+        <w:t>poravnanje elemenata</w:t>
+      </w:r>
+      <w:r>
+        <w:rPr>
+          <w:lang w:val="hr-HR"/>
+        </w:rPr>
+        <w:t xml:space="preserve"> u pravokutnu mrežu</w:t>
+      </w:r>
+      <w:r>
+        <w:rPr>
+          <w:lang w:val="hr-HR"/>
+        </w:rPr>
+        <w:t xml:space="preserve"> i</w:t>
+      </w:r>
+      <w:r>
+        <w:rPr>
+          <w:lang w:val="hr-HR"/>
+        </w:rPr>
+        <w:t xml:space="preserve"> bolja optimizacija</w:t>
+      </w:r>
+      <w:r>
+        <w:rPr>
+          <w:lang w:val="hr-HR"/>
+        </w:rPr>
+        <w:t>. Oblici modela građevina i cesta</w:t>
+      </w:r>
+      <w:r>
+        <w:rPr>
+          <w:lang w:val="hr-HR"/>
+        </w:rPr>
+        <w:t xml:space="preserve"> </w:t>
+      </w:r>
+      <w:r>
+        <w:rPr>
+          <w:lang w:val="hr-HR"/>
+        </w:rPr>
+        <w:t>čine ovaj alat</w:t>
+      </w:r>
+      <w:r>
+        <w:rPr>
+          <w:lang w:val="hr-HR"/>
+        </w:rPr>
+        <w:t xml:space="preserve"> idealnim za izgradnju</w:t>
+      </w:r>
+      <w:r>
+        <w:rPr>
+          <w:lang w:val="hr-HR"/>
+        </w:rPr>
+        <w:t xml:space="preserve"> i dizajniranje</w:t>
+      </w:r>
+      <w:r>
+        <w:rPr>
+          <w:lang w:val="hr-HR"/>
+        </w:rPr>
+        <w:t xml:space="preserve"> grad</w:t>
+      </w:r>
+      <w:r>
+        <w:rPr>
+          <w:lang w:val="hr-HR"/>
+        </w:rPr>
+        <w:t>a</w:t>
+      </w:r>
+      <w:r>
+        <w:rPr>
+          <w:lang w:val="hr-HR"/>
+        </w:rPr>
+        <w:t>.</w:t>
+      </w:r>
+    </w:p>
+    <w:p>
+      <w:pPr>
+        <w:pStyle w:val="BodyText"/>
+        <w:jc w:val="both"/>
+        <w:rPr>
+          <w:lang w:val="hr-HR"/>
+        </w:rPr>
+      </w:pPr>
+    </w:p>
+    <w:p>
+      <w:pPr>
+        <w:pStyle w:val="BodyText"/>
+        <w:jc w:val="center"/>
+        <w:rPr>
+          <w:lang w:val="hr-HR"/>
+        </w:rPr>
+      </w:pPr>
+      <w:r>
+        <w:rPr>
+          <w:noProof/>
+          <w:lang w:val="hr-HR"/>
+        </w:rPr>
+        <w:drawing>
+          <wp:inline distT="0" distB="0" distL="0" distR="0" wp14:anchorId="55F79825" wp14:editId="5BF8B638">
+            <wp:extent cx="3575713" cy="2331472"/>
+            <wp:effectExtent l="0" t="0" r="5715" b="0"/>
+            <wp:docPr id="137277333" name="Picture 6" descr="A group of buildings and squares&#10;&#10;AI-generated content may be incorrect."/>
+            <wp:cNvGraphicFramePr>
+              <a:graphicFrameLocks xmlns:a="http://schemas.openxmlformats.org/drawingml/2006/main" noChangeAspect="1"/>
+            </wp:cNvGraphicFramePr>
+            <a:graphic xmlns:a="http://schemas.openxmlformats.org/drawingml/2006/main">
+              <a:graphicData uri="http://schemas.openxmlformats.org/drawingml/2006/picture">
+                <pic:pic xmlns:pic="http://schemas.openxmlformats.org/drawingml/2006/picture">
+                  <pic:nvPicPr>
+                    <pic:cNvPr id="137277333" name="Picture 6" descr="A group of buildings and squares&#10;&#10;AI-generated content may be incorrect."/>
+                    <pic:cNvPicPr/>
+                  </pic:nvPicPr>
+                  <pic:blipFill>
+                    <a:blip r:embed="rId16" cstate="print">
+                      <a:extLst>
+                        <a:ext uri="{28A0092B-C50C-407E-A947-70E740481C1C}">
+                          <a14:useLocalDpi xmlns:a14="http://schemas.microsoft.com/office/drawing/2010/main" val="0"/>
+                        </a:ext>
+                      </a:extLst>
+                    </a:blip>
+                    <a:stretch>
+                      <a:fillRect/>
+                    </a:stretch>
+                  </pic:blipFill>
+                  <pic:spPr>
+                    <a:xfrm>
+                      <a:off x="0" y="0"/>
+                      <a:ext cx="3587012" cy="2338839"/>
+                    </a:xfrm>
+                    <a:prstGeom prst="rect">
+                      <a:avLst/>
+                    </a:prstGeom>
+                  </pic:spPr>
+                </pic:pic>
+              </a:graphicData>
+            </a:graphic>
+          </wp:inline>
+        </w:drawing>
+      </w:r>
+    </w:p>
+    <w:p>
+      <w:pPr>
+        <w:pStyle w:val="BodyText"/>
+        <w:jc w:val="center"/>
+        <w:rPr>
+          <w:color w:val="808080" w:themeColor="background1" w:themeShade="80"/>
+          <w:lang w:val="hr-HR"/>
+        </w:rPr>
+      </w:pPr>
+      <w:r>
+        <w:rPr>
+          <w:color w:val="808080" w:themeColor="background1" w:themeShade="80"/>
+          <w:lang w:val="hr-HR"/>
+        </w:rPr>
+        <w:t xml:space="preserve">Slika 4: </w:t>
+      </w:r>
+      <w:r>
+        <w:rPr>
+          <w:color w:val="808080" w:themeColor="background1" w:themeShade="80"/>
+          <w:lang w:val="hr-HR"/>
+        </w:rPr>
+        <w:t>Prikaz modela na postavljenih u GridMap alatu</w:t>
+      </w:r>
+    </w:p>
+    <w:p>
+      <w:pPr>
+        <w:pStyle w:val="BodyText"/>
+        <w:jc w:val="both"/>
+        <w:rPr>
+          <w:lang w:val="hr-HR"/>
+        </w:rPr>
+      </w:pPr>
+    </w:p>
+    <w:p>
+      <w:pPr>
+        <w:pStyle w:val="BodyText"/>
+        <w:rPr>
+          <w:lang w:val="hr-HR"/>
+        </w:rPr>
+      </w:pPr>
+      <w:r>
+        <w:rPr>
+          <w:lang w:val="hr-HR"/>
+        </w:rPr>
+        <w:t>[opis i slika rasporeda grada kad bude gotov]</w:t>
+      </w:r>
     </w:p>
     <w:p>
       <w:pPr>
@@ -2933,19 +4985,7 @@
         <w:rPr>
           <w:lang w:val="hr-HR"/>
         </w:rPr>
-        <w:t>[</w:t>
-      </w:r>
-      <w:r>
-        <w:rPr>
-          <w:lang w:val="hr-HR"/>
-        </w:rPr>
-        <w:t>main menu, HUD</w:t>
-      </w:r>
-      <w:r>
-        <w:rPr>
-          <w:lang w:val="hr-HR"/>
-        </w:rPr>
-        <w:t>]</w:t>
+        <w:t>[main menu, HUD]</w:t>
       </w:r>
     </w:p>
     <w:p>
@@ -2975,19 +5015,7 @@
         <w:rPr>
           <w:lang w:val="hr-HR"/>
         </w:rPr>
-        <w:t>[</w:t>
-      </w:r>
-      <w:r>
-        <w:rPr>
-          <w:lang w:val="hr-HR"/>
-        </w:rPr>
-        <w:t>detaljno opisano što treba raditi</w:t>
-      </w:r>
-      <w:r>
-        <w:rPr>
-          <w:lang w:val="hr-HR"/>
-        </w:rPr>
-        <w:t>]</w:t>
+        <w:t>[detaljno opisano što treba raditi]</w:t>
       </w:r>
     </w:p>
     <w:p>
@@ -3152,7 +5180,13 @@
             <w:rPr>
               <w:lang w:val="hr-HR"/>
             </w:rPr>
-            <w:t>FER  - Projekt</w:t>
+            <w:t xml:space="preserve">FER  </w:t>
+          </w:r>
+          <w:r>
+            <w:rPr>
+              <w:lang w:val="hr-HR"/>
+            </w:rPr>
+            <w:t>- Projekt</w:t>
           </w:r>
         </w:p>
       </w:tc>
@@ -3433,7 +5467,7 @@
             <w:rPr>
               <w:lang w:val="hr-HR"/>
             </w:rPr>
-            <w:t>1</w:t>
+            <w:t>2</w:t>
           </w:r>
           <w:r>
             <w:rPr>
@@ -4413,7 +6447,7 @@
     <w:rPrDefault>
       <w:rPr>
         <w:rFonts w:ascii="Times New Roman" w:eastAsia="Times New Roman" w:hAnsi="Times New Roman" w:cs="Times New Roman"/>
-        <w:lang w:eastAsia="en-GB" w:bidi="ar-SA"/>
+        <w:lang w:val="hr-HR" w:eastAsia="en-GB" w:bidi="ar-SA"/>
       </w:rPr>
     </w:rPrDefault>
     <w:pPrDefault/>
@@ -4867,7 +6901,6 @@
   <w:style w:type="character" w:default="1" w:styleId="DefaultParagraphFont">
     <w:name w:val="Default Paragraph Font"/>
     <w:uiPriority w:val="1"/>
-    <w:semiHidden/>
     <w:unhideWhenUsed/>
   </w:style>
   <w:style w:type="table" w:default="1" w:styleId="TableNormal">

</xml_diff>